<commit_message>
Add BCA 601 inside study meterials
</commit_message>
<xml_diff>
--- a/BCA-609_Data_Visualization_Lab - Dr. Chetna Thakur/Program_Report_File/Index File BCA-513.docx
+++ b/BCA-609_Data_Visualization_Lab - Dr. Chetna Thakur/Program_Report_File/Index File BCA-513.docx
@@ -42,10 +42,10 @@
         <w:tblLook w:val="04A0" w:firstRow="1" w:lastRow="0" w:firstColumn="1" w:lastColumn="0" w:noHBand="0" w:noVBand="1"/>
       </w:tblPr>
       <w:tblGrid>
-        <w:gridCol w:w="668"/>
-        <w:gridCol w:w="6081"/>
-        <w:gridCol w:w="1550"/>
-        <w:gridCol w:w="1500"/>
+        <w:gridCol w:w="667"/>
+        <w:gridCol w:w="5962"/>
+        <w:gridCol w:w="1672"/>
+        <w:gridCol w:w="1498"/>
         <w:gridCol w:w="1217"/>
       </w:tblGrid>
       <w:tr>
@@ -98,7 +98,7 @@
         </w:tc>
         <w:tc>
           <w:tcPr>
-            <w:tcW w:w="0" w:type="auto"/>
+            <w:tcW w:w="5962" w:type="dxa"/>
             <w:vAlign w:val="center"/>
           </w:tcPr>
           <w:p>
@@ -124,7 +124,7 @@
         </w:tc>
         <w:tc>
           <w:tcPr>
-            <w:tcW w:w="0" w:type="auto"/>
+            <w:tcW w:w="1672" w:type="dxa"/>
             <w:vAlign w:val="center"/>
           </w:tcPr>
           <w:p>
@@ -306,7 +306,7 @@
         </w:tc>
         <w:tc>
           <w:tcPr>
-            <w:tcW w:w="0" w:type="auto"/>
+            <w:tcW w:w="5962" w:type="dxa"/>
           </w:tcPr>
           <w:p>
             <w:pPr>
@@ -330,7 +330,7 @@
         </w:tc>
         <w:tc>
           <w:tcPr>
-            <w:tcW w:w="0" w:type="auto"/>
+            <w:tcW w:w="1672" w:type="dxa"/>
             <w:vAlign w:val="center"/>
           </w:tcPr>
           <w:p>
@@ -468,7 +468,7 @@
         </w:tc>
         <w:tc>
           <w:tcPr>
-            <w:tcW w:w="0" w:type="auto"/>
+            <w:tcW w:w="5962" w:type="dxa"/>
           </w:tcPr>
           <w:p>
             <w:pPr>
@@ -492,7 +492,7 @@
         </w:tc>
         <w:tc>
           <w:tcPr>
-            <w:tcW w:w="0" w:type="auto"/>
+            <w:tcW w:w="1672" w:type="dxa"/>
             <w:vAlign w:val="center"/>
           </w:tcPr>
           <w:p>
@@ -630,7 +630,7 @@
         </w:tc>
         <w:tc>
           <w:tcPr>
-            <w:tcW w:w="0" w:type="auto"/>
+            <w:tcW w:w="5962" w:type="dxa"/>
           </w:tcPr>
           <w:p>
             <w:pPr>
@@ -654,7 +654,7 @@
         </w:tc>
         <w:tc>
           <w:tcPr>
-            <w:tcW w:w="0" w:type="auto"/>
+            <w:tcW w:w="1672" w:type="dxa"/>
             <w:vAlign w:val="center"/>
           </w:tcPr>
           <w:p>
@@ -792,7 +792,7 @@
         </w:tc>
         <w:tc>
           <w:tcPr>
-            <w:tcW w:w="0" w:type="auto"/>
+            <w:tcW w:w="5962" w:type="dxa"/>
           </w:tcPr>
           <w:p>
             <w:pPr>
@@ -816,7 +816,7 @@
         </w:tc>
         <w:tc>
           <w:tcPr>
-            <w:tcW w:w="0" w:type="auto"/>
+            <w:tcW w:w="1672" w:type="dxa"/>
             <w:vAlign w:val="center"/>
           </w:tcPr>
           <w:p>
@@ -954,7 +954,7 @@
         </w:tc>
         <w:tc>
           <w:tcPr>
-            <w:tcW w:w="0" w:type="auto"/>
+            <w:tcW w:w="5962" w:type="dxa"/>
           </w:tcPr>
           <w:p>
             <w:pPr>
@@ -978,11 +978,12 @@
         </w:tc>
         <w:tc>
           <w:tcPr>
-            <w:tcW w:w="0" w:type="auto"/>
-            <w:vAlign w:val="center"/>
-          </w:tcPr>
-          <w:p>
-            <w:pPr>
+            <w:tcW w:w="1672" w:type="dxa"/>
+            <w:vAlign w:val="center"/>
+          </w:tcPr>
+          <w:p>
+            <w:pPr>
+              <w:jc w:val="center"/>
               <w:rPr>
                 <w:rFonts w:ascii="Times New Roman" w:hAnsi="Times New Roman" w:cs="Times New Roman"/>
                 <w:bCs/>
@@ -990,15 +991,44 @@
                 <w:szCs w:val="24"/>
               </w:rPr>
             </w:pPr>
-          </w:p>
-        </w:tc>
-        <w:tc>
-          <w:tcPr>
-            <w:tcW w:w="0" w:type="auto"/>
-            <w:vAlign w:val="center"/>
-          </w:tcPr>
-          <w:p>
-            <w:pPr>
+            <w:r>
+              <w:rPr>
+                <w:rFonts w:ascii="Times New Roman" w:hAnsi="Times New Roman" w:cs="Times New Roman"/>
+                <w:bCs/>
+                <w:sz w:val="24"/>
+                <w:szCs w:val="24"/>
+              </w:rPr>
+              <w:t>06</w:t>
+            </w:r>
+            <w:r>
+              <w:rPr>
+                <w:rFonts w:ascii="Times New Roman" w:hAnsi="Times New Roman" w:cs="Times New Roman"/>
+                <w:bCs/>
+                <w:sz w:val="24"/>
+                <w:szCs w:val="24"/>
+                <w:vertAlign w:val="superscript"/>
+              </w:rPr>
+              <w:t>th</w:t>
+            </w:r>
+            <w:r>
+              <w:rPr>
+                <w:rFonts w:ascii="Times New Roman" w:hAnsi="Times New Roman" w:cs="Times New Roman"/>
+                <w:bCs/>
+                <w:sz w:val="24"/>
+                <w:szCs w:val="24"/>
+              </w:rPr>
+              <w:t xml:space="preserve"> February, 2026</w:t>
+            </w:r>
+          </w:p>
+        </w:tc>
+        <w:tc>
+          <w:tcPr>
+            <w:tcW w:w="0" w:type="auto"/>
+            <w:vAlign w:val="center"/>
+          </w:tcPr>
+          <w:p>
+            <w:pPr>
+              <w:jc w:val="center"/>
               <w:rPr>
                 <w:rFonts w:ascii="Times New Roman" w:hAnsi="Times New Roman" w:cs="Times New Roman"/>
                 <w:bCs/>
@@ -1058,7 +1088,7 @@
         </w:tc>
         <w:tc>
           <w:tcPr>
-            <w:tcW w:w="0" w:type="auto"/>
+            <w:tcW w:w="5962" w:type="dxa"/>
           </w:tcPr>
           <w:p>
             <w:pPr>
@@ -1082,11 +1112,12 @@
         </w:tc>
         <w:tc>
           <w:tcPr>
-            <w:tcW w:w="0" w:type="auto"/>
-            <w:vAlign w:val="center"/>
-          </w:tcPr>
-          <w:p>
-            <w:pPr>
+            <w:tcW w:w="1672" w:type="dxa"/>
+            <w:vAlign w:val="center"/>
+          </w:tcPr>
+          <w:p>
+            <w:pPr>
+              <w:jc w:val="center"/>
               <w:rPr>
                 <w:rFonts w:ascii="Times New Roman" w:hAnsi="Times New Roman" w:cs="Times New Roman"/>
                 <w:bCs/>
@@ -1103,6 +1134,7 @@
           </w:tcPr>
           <w:p>
             <w:pPr>
+              <w:jc w:val="center"/>
               <w:rPr>
                 <w:rFonts w:ascii="Times New Roman" w:hAnsi="Times New Roman" w:cs="Times New Roman"/>
                 <w:bCs/>
@@ -1212,7 +1244,7 @@
         </w:tc>
         <w:tc>
           <w:tcPr>
-            <w:tcW w:w="0" w:type="auto"/>
+            <w:tcW w:w="5962" w:type="dxa"/>
           </w:tcPr>
           <w:p>
             <w:pPr>
@@ -1236,7 +1268,7 @@
         </w:tc>
         <w:tc>
           <w:tcPr>
-            <w:tcW w:w="0" w:type="auto"/>
+            <w:tcW w:w="1672" w:type="dxa"/>
             <w:vAlign w:val="center"/>
           </w:tcPr>
           <w:p>
@@ -1336,7 +1368,7 @@
         </w:tc>
         <w:tc>
           <w:tcPr>
-            <w:tcW w:w="0" w:type="auto"/>
+            <w:tcW w:w="5962" w:type="dxa"/>
           </w:tcPr>
           <w:p>
             <w:pPr>
@@ -1360,7 +1392,7 @@
         </w:tc>
         <w:tc>
           <w:tcPr>
-            <w:tcW w:w="0" w:type="auto"/>
+            <w:tcW w:w="1672" w:type="dxa"/>
             <w:vAlign w:val="center"/>
           </w:tcPr>
           <w:p>
@@ -1442,7 +1474,7 @@
         </w:tc>
         <w:tc>
           <w:tcPr>
-            <w:tcW w:w="0" w:type="auto"/>
+            <w:tcW w:w="5962" w:type="dxa"/>
           </w:tcPr>
           <w:p>
             <w:pPr>
@@ -1466,7 +1498,7 @@
         </w:tc>
         <w:tc>
           <w:tcPr>
-            <w:tcW w:w="0" w:type="auto"/>
+            <w:tcW w:w="1672" w:type="dxa"/>
             <w:vAlign w:val="center"/>
           </w:tcPr>
           <w:p>
@@ -1548,7 +1580,7 @@
         </w:tc>
         <w:tc>
           <w:tcPr>
-            <w:tcW w:w="0" w:type="auto"/>
+            <w:tcW w:w="5962" w:type="dxa"/>
           </w:tcPr>
           <w:p>
             <w:pPr>
@@ -1572,7 +1604,7 @@
         </w:tc>
         <w:tc>
           <w:tcPr>
-            <w:tcW w:w="0" w:type="auto"/>
+            <w:tcW w:w="1672" w:type="dxa"/>
             <w:vAlign w:val="center"/>
           </w:tcPr>
           <w:p>
@@ -1654,7 +1686,7 @@
         </w:tc>
         <w:tc>
           <w:tcPr>
-            <w:tcW w:w="0" w:type="auto"/>
+            <w:tcW w:w="5962" w:type="dxa"/>
           </w:tcPr>
           <w:p>
             <w:pPr>
@@ -1678,7 +1710,7 @@
         </w:tc>
         <w:tc>
           <w:tcPr>
-            <w:tcW w:w="0" w:type="auto"/>
+            <w:tcW w:w="1672" w:type="dxa"/>
             <w:vAlign w:val="center"/>
           </w:tcPr>
           <w:p>
@@ -1760,7 +1792,7 @@
         </w:tc>
         <w:tc>
           <w:tcPr>
-            <w:tcW w:w="0" w:type="auto"/>
+            <w:tcW w:w="5962" w:type="dxa"/>
           </w:tcPr>
           <w:p>
             <w:pPr>
@@ -1784,7 +1816,7 @@
         </w:tc>
         <w:tc>
           <w:tcPr>
-            <w:tcW w:w="0" w:type="auto"/>
+            <w:tcW w:w="1672" w:type="dxa"/>
             <w:vAlign w:val="center"/>
           </w:tcPr>
           <w:p>
@@ -1898,7 +1930,7 @@
         </w:tc>
         <w:tc>
           <w:tcPr>
-            <w:tcW w:w="0" w:type="auto"/>
+            <w:tcW w:w="5962" w:type="dxa"/>
           </w:tcPr>
           <w:p>
             <w:pPr>
@@ -1922,7 +1954,7 @@
         </w:tc>
         <w:tc>
           <w:tcPr>
-            <w:tcW w:w="0" w:type="auto"/>
+            <w:tcW w:w="1672" w:type="dxa"/>
             <w:vAlign w:val="center"/>
           </w:tcPr>
           <w:p>
@@ -2004,7 +2036,7 @@
         </w:tc>
         <w:tc>
           <w:tcPr>
-            <w:tcW w:w="0" w:type="auto"/>
+            <w:tcW w:w="5962" w:type="dxa"/>
           </w:tcPr>
           <w:p>
             <w:pPr>
@@ -2028,7 +2060,7 @@
         </w:tc>
         <w:tc>
           <w:tcPr>
-            <w:tcW w:w="0" w:type="auto"/>
+            <w:tcW w:w="1672" w:type="dxa"/>
             <w:vAlign w:val="center"/>
           </w:tcPr>
           <w:p>
@@ -2110,7 +2142,7 @@
         </w:tc>
         <w:tc>
           <w:tcPr>
-            <w:tcW w:w="0" w:type="auto"/>
+            <w:tcW w:w="5962" w:type="dxa"/>
           </w:tcPr>
           <w:p>
             <w:pPr>
@@ -2134,7 +2166,7 @@
         </w:tc>
         <w:tc>
           <w:tcPr>
-            <w:tcW w:w="0" w:type="auto"/>
+            <w:tcW w:w="1672" w:type="dxa"/>
             <w:vAlign w:val="center"/>
           </w:tcPr>
           <w:p>
@@ -2216,7 +2248,7 @@
         </w:tc>
         <w:tc>
           <w:tcPr>
-            <w:tcW w:w="0" w:type="auto"/>
+            <w:tcW w:w="5962" w:type="dxa"/>
           </w:tcPr>
           <w:p>
             <w:pPr>
@@ -2240,7 +2272,7 @@
         </w:tc>
         <w:tc>
           <w:tcPr>
-            <w:tcW w:w="0" w:type="auto"/>
+            <w:tcW w:w="1672" w:type="dxa"/>
             <w:vAlign w:val="center"/>
           </w:tcPr>
           <w:p>
@@ -2322,7 +2354,7 @@
         </w:tc>
         <w:tc>
           <w:tcPr>
-            <w:tcW w:w="0" w:type="auto"/>
+            <w:tcW w:w="5962" w:type="dxa"/>
           </w:tcPr>
           <w:p>
             <w:pPr>
@@ -2346,7 +2378,7 @@
         </w:tc>
         <w:tc>
           <w:tcPr>
-            <w:tcW w:w="0" w:type="auto"/>
+            <w:tcW w:w="1672" w:type="dxa"/>
             <w:vAlign w:val="center"/>
           </w:tcPr>
           <w:p>
@@ -2428,7 +2460,7 @@
         </w:tc>
         <w:tc>
           <w:tcPr>
-            <w:tcW w:w="0" w:type="auto"/>
+            <w:tcW w:w="5962" w:type="dxa"/>
             <w:vAlign w:val="center"/>
           </w:tcPr>
           <w:p>
@@ -2453,7 +2485,7 @@
         </w:tc>
         <w:tc>
           <w:tcPr>
-            <w:tcW w:w="0" w:type="auto"/>
+            <w:tcW w:w="1672" w:type="dxa"/>
             <w:vAlign w:val="center"/>
           </w:tcPr>
           <w:p>
@@ -2568,7 +2600,7 @@
         </w:tc>
         <w:tc>
           <w:tcPr>
-            <w:tcW w:w="0" w:type="auto"/>
+            <w:tcW w:w="5962" w:type="dxa"/>
           </w:tcPr>
           <w:p>
             <w:pPr>
@@ -2592,7 +2624,7 @@
         </w:tc>
         <w:tc>
           <w:tcPr>
-            <w:tcW w:w="0" w:type="auto"/>
+            <w:tcW w:w="1672" w:type="dxa"/>
             <w:vAlign w:val="center"/>
           </w:tcPr>
           <w:p>
@@ -2674,7 +2706,7 @@
         </w:tc>
         <w:tc>
           <w:tcPr>
-            <w:tcW w:w="0" w:type="auto"/>
+            <w:tcW w:w="5962" w:type="dxa"/>
           </w:tcPr>
           <w:p>
             <w:pPr>
@@ -2698,7 +2730,7 @@
         </w:tc>
         <w:tc>
           <w:tcPr>
-            <w:tcW w:w="0" w:type="auto"/>
+            <w:tcW w:w="1672" w:type="dxa"/>
             <w:vAlign w:val="center"/>
           </w:tcPr>
           <w:p>
@@ -2780,7 +2812,7 @@
         </w:tc>
         <w:tc>
           <w:tcPr>
-            <w:tcW w:w="0" w:type="auto"/>
+            <w:tcW w:w="5962" w:type="dxa"/>
           </w:tcPr>
           <w:p>
             <w:pPr>
@@ -2804,7 +2836,7 @@
         </w:tc>
         <w:tc>
           <w:tcPr>
-            <w:tcW w:w="0" w:type="auto"/>
+            <w:tcW w:w="1672" w:type="dxa"/>
             <w:vAlign w:val="center"/>
           </w:tcPr>
           <w:p>
@@ -2886,7 +2918,7 @@
         </w:tc>
         <w:tc>
           <w:tcPr>
-            <w:tcW w:w="0" w:type="auto"/>
+            <w:tcW w:w="5962" w:type="dxa"/>
           </w:tcPr>
           <w:p>
             <w:pPr>
@@ -2910,7 +2942,7 @@
         </w:tc>
         <w:tc>
           <w:tcPr>
-            <w:tcW w:w="0" w:type="auto"/>
+            <w:tcW w:w="1672" w:type="dxa"/>
             <w:vAlign w:val="center"/>
           </w:tcPr>
           <w:p>
@@ -2992,7 +3024,7 @@
         </w:tc>
         <w:tc>
           <w:tcPr>
-            <w:tcW w:w="0" w:type="auto"/>
+            <w:tcW w:w="5962" w:type="dxa"/>
           </w:tcPr>
           <w:p>
             <w:pPr>
@@ -3016,7 +3048,7 @@
         </w:tc>
         <w:tc>
           <w:tcPr>
-            <w:tcW w:w="0" w:type="auto"/>
+            <w:tcW w:w="1672" w:type="dxa"/>
             <w:vAlign w:val="center"/>
           </w:tcPr>
           <w:p>
@@ -3098,7 +3130,7 @@
         </w:tc>
         <w:tc>
           <w:tcPr>
-            <w:tcW w:w="0" w:type="auto"/>
+            <w:tcW w:w="5962" w:type="dxa"/>
           </w:tcPr>
           <w:p>
             <w:pPr>
@@ -3122,7 +3154,7 @@
         </w:tc>
         <w:tc>
           <w:tcPr>
-            <w:tcW w:w="0" w:type="auto"/>
+            <w:tcW w:w="1672" w:type="dxa"/>
             <w:vAlign w:val="center"/>
           </w:tcPr>
           <w:p>
@@ -3248,7 +3280,7 @@
         </w:tc>
         <w:tc>
           <w:tcPr>
-            <w:tcW w:w="0" w:type="auto"/>
+            <w:tcW w:w="5962" w:type="dxa"/>
             <w:vAlign w:val="center"/>
           </w:tcPr>
           <w:p>
@@ -3267,7 +3299,7 @@
         </w:tc>
         <w:tc>
           <w:tcPr>
-            <w:tcW w:w="0" w:type="auto"/>
+            <w:tcW w:w="1672" w:type="dxa"/>
             <w:vAlign w:val="center"/>
           </w:tcPr>
           <w:p>

</xml_diff>